<commit_message>
profiles-ext/i-sadav#6100 DOCUMENTO RESULTADO H1
</commit_message>
<xml_diff>
--- a/Documents/RESULTADO H1.docx
+++ b/Documents/RESULTADO H1.docx
@@ -162,13 +162,8 @@
               <w:spacing w:after="160" w:line="278" w:lineRule="auto"/>
             </w:pPr>
             <w:r>
-              <w:t>p-</w:t>
-            </w:r>
-            <w:proofErr w:type="spellStart"/>
-            <w:r>
-              <w:t>value</w:t>
-            </w:r>
-            <w:proofErr w:type="spellEnd"/>
+              <w:t>p-value</w:t>
+            </w:r>
           </w:p>
         </w:tc>
         <w:tc>
@@ -393,23 +388,7 @@
           <w:b/>
           <w:bCs/>
         </w:rPr>
-        <w:t xml:space="preserve">1. </w:t>
-      </w:r>
-      <w:proofErr w:type="gramStart"/>
-      <w:r>
-        <w:rPr>
-          <w:b/>
-          <w:bCs/>
-        </w:rPr>
-        <w:t>¿Qué significa ρ = 0.</w:t>
-      </w:r>
-      <w:proofErr w:type="gramEnd"/>
-      <w:r>
-        <w:rPr>
-          <w:b/>
-          <w:bCs/>
-        </w:rPr>
-        <w:t>08?</w:t>
+        <w:t>1. ¿Qué significa ρ = 0.08?</w:t>
       </w:r>
     </w:p>
     <w:p>
@@ -459,11 +438,7 @@
         <w:t>│ρ│</w:t>
       </w:r>
       <w:r>
-        <w:t xml:space="preserve"> &lt; </w:t>
-      </w:r>
-      <w:proofErr w:type="gramStart"/>
-      <w:r>
-        <w:t xml:space="preserve">0.30  </w:t>
+        <w:t xml:space="preserve"> &lt; 0.30  </w:t>
       </w:r>
       <w:r>
         <w:rPr>
@@ -471,7 +446,6 @@
         </w:rPr>
         <w:t>→</w:t>
       </w:r>
-      <w:proofErr w:type="gramEnd"/>
       <w:r>
         <w:t xml:space="preserve">  Pequeño</w:t>
       </w:r>
@@ -487,11 +461,7 @@
         <w:t>│ρ│</w:t>
       </w:r>
       <w:r>
-        <w:t xml:space="preserve"> &lt; </w:t>
-      </w:r>
-      <w:proofErr w:type="gramStart"/>
-      <w:r>
-        <w:t xml:space="preserve">0.50  </w:t>
+        <w:t xml:space="preserve"> &lt; 0.50  </w:t>
       </w:r>
       <w:r>
         <w:rPr>
@@ -499,7 +469,6 @@
         </w:rPr>
         <w:t>→</w:t>
       </w:r>
-      <w:proofErr w:type="gramEnd"/>
       <w:r>
         <w:t xml:space="preserve">  Mediano</w:t>
       </w:r>
@@ -601,23 +570,7 @@
           <w:bCs/>
         </w:rPr>
         <w:lastRenderedPageBreak/>
-        <w:t xml:space="preserve">2. </w:t>
-      </w:r>
-      <w:proofErr w:type="gramStart"/>
-      <w:r>
-        <w:rPr>
-          <w:b/>
-          <w:bCs/>
-        </w:rPr>
-        <w:t>¿Por qué p = 0.</w:t>
-      </w:r>
-      <w:proofErr w:type="gramEnd"/>
-      <w:r>
-        <w:rPr>
-          <w:b/>
-          <w:bCs/>
-        </w:rPr>
-        <w:t>0001 pero la conclusión es "Sin evidencia suficiente"?</w:t>
+        <w:t>2. ¿Por qué p = 0.0001 pero la conclusión es "Sin evidencia suficiente"?</w:t>
       </w:r>
     </w:p>
     <w:p>
@@ -741,6 +694,9 @@
           <w:p>
             <w:pPr>
               <w:spacing w:after="160" w:line="278" w:lineRule="auto"/>
+              <w:rPr>
+                <w:u w:val="single"/>
+              </w:rPr>
             </w:pPr>
             <w:r>
               <w:t xml:space="preserve">p = 0.0001 &lt; 0.05 </w:t>
@@ -838,39 +794,7 @@
     <w:p/>
     <w:p>
       <w:r>
-        <w:t>rechazarH0 = (</w:t>
-      </w:r>
-      <w:proofErr w:type="spellStart"/>
-      <w:r>
-        <w:t>pValue</w:t>
-      </w:r>
-      <w:proofErr w:type="spellEnd"/>
-      <w:r>
-        <w:t xml:space="preserve"> &lt; </w:t>
-      </w:r>
-      <w:proofErr w:type="spellStart"/>
-      <w:r>
-        <w:t>alpha</w:t>
-      </w:r>
-      <w:proofErr w:type="spellEnd"/>
-      <w:r>
-        <w:t>) &amp;&amp; (</w:t>
-      </w:r>
-      <w:proofErr w:type="spellStart"/>
-      <w:r>
-        <w:t>Math.Abs</w:t>
-      </w:r>
-      <w:proofErr w:type="spellEnd"/>
-      <w:r>
-        <w:t xml:space="preserve">(rho) &gt;= </w:t>
-      </w:r>
-      <w:proofErr w:type="spellStart"/>
-      <w:r>
-        <w:t>minEfectoRelevante</w:t>
-      </w:r>
-      <w:proofErr w:type="spellEnd"/>
-      <w:r>
-        <w:t>);</w:t>
+        <w:t>rechazarH0 = (pValue &lt; alpha) &amp;&amp; (Math.Abs(rho) &gt;= minEfectoRelevante);</w:t>
       </w:r>
     </w:p>
     <w:p/>
@@ -1271,15 +1195,7 @@
               <w:cnfStyle w:val="000000100000" w:firstRow="0" w:lastRow="0" w:firstColumn="0" w:lastColumn="0" w:oddVBand="0" w:evenVBand="0" w:oddHBand="1" w:evenHBand="0" w:firstRowFirstColumn="0" w:firstRowLastColumn="0" w:lastRowFirstColumn="0" w:lastRowLastColumn="0"/>
             </w:pPr>
             <w:r>
-              <w:t>El efecto de la antigüedad depende de otros factores (</w:t>
-            </w:r>
-            <w:proofErr w:type="spellStart"/>
-            <w:r>
-              <w:t>ej</w:t>
-            </w:r>
-            <w:proofErr w:type="spellEnd"/>
-            <w:r>
-              <w:t>: tipo de contrato)</w:t>
+              <w:t>El efecto de la antigüedad depende de otros factores (ej: tipo de contrato)</w:t>
             </w:r>
           </w:p>
         </w:tc>
@@ -1294,15 +1210,7 @@
               <w:cnfStyle w:val="000000100000" w:firstRow="0" w:lastRow="0" w:firstColumn="0" w:lastColumn="0" w:oddVBand="0" w:evenVBand="0" w:oddHBand="1" w:evenHBand="0" w:firstRowFirstColumn="0" w:firstRowLastColumn="0" w:lastRowFirstColumn="0" w:lastRowLastColumn="0"/>
             </w:pPr>
             <w:r>
-              <w:t xml:space="preserve">Análisis estratificado: </w:t>
-            </w:r>
-            <w:proofErr w:type="spellStart"/>
-            <w:r>
-              <w:t>AgruparPor</w:t>
-            </w:r>
-            <w:proofErr w:type="spellEnd"/>
-            <w:r>
-              <w:t>("Contrato")</w:t>
+              <w:t>Análisis estratificado: AgruparPor("Contrato")</w:t>
             </w:r>
           </w:p>
         </w:tc>
@@ -1334,15 +1242,7 @@
               <w:cnfStyle w:val="000000000000" w:firstRow="0" w:lastRow="0" w:firstColumn="0" w:lastColumn="0" w:oddVBand="0" w:evenVBand="0" w:oddHBand="0" w:evenHBand="0" w:firstRowFirstColumn="0" w:firstRowLastColumn="0" w:lastRowFirstColumn="0" w:lastRowLastColumn="0"/>
             </w:pPr>
             <w:r>
-              <w:t>La relación podría ser curva (</w:t>
-            </w:r>
-            <w:proofErr w:type="spellStart"/>
-            <w:r>
-              <w:t>ej</w:t>
-            </w:r>
-            <w:proofErr w:type="spellEnd"/>
-            <w:r>
-              <w:t>: bienestar alto al inicio, bajo a medio plazo, alto al final)</w:t>
+              <w:t>La relación podría ser curva (ej: bienestar alto al inicio, bajo a medio plazo, alto al final)</w:t>
             </w:r>
           </w:p>
         </w:tc>
@@ -1407,13 +1307,8 @@
               <w:cnfStyle w:val="000000100000" w:firstRow="0" w:lastRow="0" w:firstColumn="0" w:lastColumn="0" w:oddVBand="0" w:evenVBand="0" w:oddHBand="1" w:evenHBand="0" w:firstRowFirstColumn="0" w:firstRowLastColumn="0" w:lastRowFirstColumn="0" w:lastRowLastColumn="0"/>
             </w:pPr>
             <w:r>
-              <w:t xml:space="preserve">Segmentar por </w:t>
-            </w:r>
-            <w:proofErr w:type="spellStart"/>
-            <w:r>
-              <w:t>Departamento_Area</w:t>
-            </w:r>
-            <w:proofErr w:type="spellEnd"/>
+              <w:t>Segmentar por Departamento_Area</w:t>
+            </w:r>
           </w:p>
         </w:tc>
       </w:tr>
@@ -1547,31 +1442,7 @@
         <w:t>Visualizar la relación</w:t>
       </w:r>
       <w:r>
-        <w:t xml:space="preserve">: Generar un </w:t>
-      </w:r>
-      <w:proofErr w:type="spellStart"/>
-      <w:r>
-        <w:t>scatter</w:t>
-      </w:r>
-      <w:proofErr w:type="spellEnd"/>
-      <w:r>
-        <w:t xml:space="preserve"> </w:t>
-      </w:r>
-      <w:proofErr w:type="spellStart"/>
-      <w:r>
-        <w:t>plot</w:t>
-      </w:r>
-      <w:proofErr w:type="spellEnd"/>
-      <w:r>
-        <w:t xml:space="preserve"> con línea de tendencia para comunicar el hallazgo a </w:t>
-      </w:r>
-      <w:proofErr w:type="spellStart"/>
-      <w:r>
-        <w:t>stakeholders</w:t>
-      </w:r>
-      <w:proofErr w:type="spellEnd"/>
-      <w:r>
-        <w:t>.</w:t>
+        <w:t>: Generar un scatter plot con línea de tendencia para comunicar el hallazgo a stakeholders.</w:t>
       </w:r>
     </w:p>
     <w:p>
@@ -1690,21 +1561,12 @@
           <w:bCs/>
         </w:rPr>
       </w:pPr>
-      <w:proofErr w:type="spellStart"/>
-      <w:r>
-        <w:rPr>
-          <w:b/>
-          <w:bCs/>
-        </w:rPr>
-        <w:t>Checklist</w:t>
-      </w:r>
-      <w:proofErr w:type="spellEnd"/>
-      <w:r>
-        <w:rPr>
-          <w:b/>
-          <w:bCs/>
-        </w:rPr>
-        <w:t xml:space="preserve"> de Próximos Pasos</w:t>
+      <w:r>
+        <w:rPr>
+          <w:b/>
+          <w:bCs/>
+        </w:rPr>
+        <w:t>Checklist de Próximos Pasos</w:t>
       </w:r>
     </w:p>
     <w:tbl>
@@ -1783,31 +1645,7 @@
               <w:spacing w:after="160" w:line="278" w:lineRule="auto"/>
             </w:pPr>
             <w:r>
-              <w:t xml:space="preserve">Visualizar relación </w:t>
-            </w:r>
-            <w:proofErr w:type="spellStart"/>
-            <w:r>
-              <w:t>Antiguedad</w:t>
-            </w:r>
-            <w:proofErr w:type="spellEnd"/>
-            <w:r>
-              <w:t xml:space="preserve"> vs Bienestar (</w:t>
-            </w:r>
-            <w:proofErr w:type="spellStart"/>
-            <w:r>
-              <w:t>scatter</w:t>
-            </w:r>
-            <w:proofErr w:type="spellEnd"/>
-            <w:r>
-              <w:t xml:space="preserve"> </w:t>
-            </w:r>
-            <w:proofErr w:type="spellStart"/>
-            <w:r>
-              <w:t>plot</w:t>
-            </w:r>
-            <w:proofErr w:type="spellEnd"/>
-            <w:r>
-              <w:t>)</w:t>
+              <w:t>Visualizar relación Antiguedad vs Bienestar (scatter plot)</w:t>
             </w:r>
           </w:p>
         </w:tc>

</xml_diff>